<commit_message>
feat: phase 1 - node focus navigation (?id=) + strength filtering + UI controls
</commit_message>
<xml_diff>
--- a/data/רבי יהושע אבן שועיב.docx
+++ b/data/רבי יהושע אבן שועיב.docx
@@ -5,6 +5,7 @@
     <w:p>
       <w:pPr>
         <w:shd w:fill="ffffff" w:val="clear"/>
+        <w:bidi w:val="1"/>
         <w:rPr>
           <w:color w:val="1b1b1c"/>
           <w:sz w:val="33"/>
@@ -78,6 +79,7 @@
     <w:p>
       <w:pPr>
         <w:shd w:fill="edeffa" w:val="clear"/>
+        <w:bidi w:val="1"/>
         <w:rPr>
           <w:color w:val="1b1b1c"/>
           <w:sz w:val="21"/>
@@ -97,6 +99,7 @@
     <w:p>
       <w:pPr>
         <w:shd w:fill="edeffa" w:val="clear"/>
+        <w:bidi w:val="1"/>
         <w:spacing w:after="160" w:lineRule="auto"/>
         <w:rPr>
           <w:color w:val="303030"/>
@@ -2008,7 +2011,7 @@
           <w:color w:val="303030"/>
           <w:sz w:val="21"/>
           <w:szCs w:val="21"/>
-          <w:rtl w:val="0"/>
+          <w:rtl w:val="1"/>
         </w:rPr>
         <w:t xml:space="preserve">.</w:t>
       </w:r>
@@ -2016,6 +2019,7 @@
     <w:p>
       <w:pPr>
         <w:shd w:fill="ffffff" w:val="clear"/>
+        <w:bidi w:val="1"/>
         <w:rPr>
           <w:b w:val="1"/>
           <w:bCs w:val="1"/>
@@ -2237,6 +2241,7 @@
     <w:p>
       <w:pPr>
         <w:shd w:fill="ffffff" w:val="clear"/>
+        <w:bidi w:val="1"/>
         <w:rPr>
           <w:b w:val="1"/>
           <w:bCs w:val="1"/>
@@ -2326,6 +2331,7 @@
     <w:p>
       <w:pPr>
         <w:shd w:fill="ffffff" w:val="clear"/>
+        <w:bidi w:val="1"/>
         <w:rPr>
           <w:color w:val="1b1b1c"/>
           <w:sz w:val="24"/>
@@ -3876,7 +3882,7 @@
           <w:color w:val="1b1b1c"/>
           <w:sz w:val="24"/>
           <w:szCs w:val="24"/>
-          <w:rtl w:val="0"/>
+          <w:rtl w:val="1"/>
         </w:rPr>
         <w:t xml:space="preserve">.</w:t>
       </w:r>
@@ -3884,6 +3890,7 @@
     <w:p>
       <w:pPr>
         <w:shd w:fill="ffffff" w:val="clear"/>
+        <w:bidi w:val="1"/>
         <w:rPr>
           <w:color w:val="1b1b1c"/>
           <w:sz w:val="24"/>
@@ -5002,7 +5009,7 @@
           <w:color w:val="1b1b1c"/>
           <w:sz w:val="24"/>
           <w:szCs w:val="24"/>
-          <w:rtl w:val="0"/>
+          <w:rtl w:val="1"/>
         </w:rPr>
         <w:t xml:space="preserve">.[1, 2]</w:t>
       </w:r>
@@ -5010,6 +5017,7 @@
     <w:p>
       <w:pPr>
         <w:shd w:fill="ffffff" w:val="clear"/>
+        <w:bidi w:val="1"/>
         <w:rPr>
           <w:color w:val="1b1b1c"/>
           <w:sz w:val="24"/>
@@ -5029,6 +5037,7 @@
     <w:p>
       <w:pPr>
         <w:shd w:fill="ffffff" w:val="clear"/>
+        <w:bidi w:val="1"/>
         <w:rPr>
           <w:b w:val="1"/>
           <w:bCs w:val="1"/>
@@ -5206,6 +5215,7 @@
     <w:p>
       <w:pPr>
         <w:shd w:fill="ffffff" w:val="clear"/>
+        <w:bidi w:val="1"/>
         <w:rPr>
           <w:color w:val="1b1b1c"/>
           <w:sz w:val="24"/>
@@ -6540,7 +6550,7 @@
           <w:color w:val="1b1b1c"/>
           <w:sz w:val="24"/>
           <w:szCs w:val="24"/>
-          <w:rtl w:val="0"/>
+          <w:rtl w:val="1"/>
         </w:rPr>
         <w:t xml:space="preserve">.[1, 2]</w:t>
       </w:r>
@@ -6548,6 +6558,7 @@
     <w:tbl>
       <w:tblPr>
         <w:tblStyle w:val="Table1"/>
+        <w:bidiVisual w:val="1"/>
         <w:tblW w:w="10960.0" w:type="dxa"/>
         <w:jc w:val="left"/>
         <w:tblBorders>
@@ -6595,6 +6606,7 @@
           </w:tcPr>
           <w:p>
             <w:pPr>
+              <w:bidi w:val="1"/>
               <w:jc w:val="center"/>
               <w:rPr>
                 <w:b w:val="1"/>
@@ -6833,6 +6845,7 @@
           </w:tcPr>
           <w:p>
             <w:pPr>
+              <w:bidi w:val="1"/>
               <w:jc w:val="center"/>
               <w:rPr>
                 <w:color w:val="1b1b1c"/>
@@ -6872,6 +6885,7 @@
           </w:tcPr>
           <w:p>
             <w:pPr>
+              <w:bidi w:val="1"/>
               <w:rPr>
                 <w:b w:val="1"/>
                 <w:bCs w:val="1"/>
@@ -6955,6 +6969,7 @@
           </w:tcPr>
           <w:p>
             <w:pPr>
+              <w:bidi w:val="1"/>
               <w:rPr>
                 <w:color w:val="1b1b1c"/>
                 <w:sz w:val="24"/>
@@ -7065,7 +7080,7 @@
                 <w:color w:val="1b1b1c"/>
                 <w:sz w:val="24"/>
                 <w:szCs w:val="24"/>
-                <w:rtl w:val="0"/>
+                <w:rtl w:val="1"/>
               </w:rPr>
               <w:t xml:space="preserve">).[2]</w:t>
             </w:r>
@@ -7096,6 +7111,7 @@
           </w:tcPr>
           <w:p>
             <w:pPr>
+              <w:bidi w:val="1"/>
               <w:rPr>
                 <w:b w:val="1"/>
                 <w:bCs w:val="1"/>
@@ -7157,6 +7173,7 @@
           </w:tcPr>
           <w:p>
             <w:pPr>
+              <w:bidi w:val="1"/>
               <w:rPr>
                 <w:color w:val="1b1b1c"/>
                 <w:sz w:val="24"/>
@@ -7429,7 +7446,7 @@
                 <w:color w:val="1b1b1c"/>
                 <w:sz w:val="24"/>
                 <w:szCs w:val="24"/>
-                <w:rtl w:val="0"/>
+                <w:rtl w:val="1"/>
               </w:rPr>
               <w:t xml:space="preserve">.[1, 2]</w:t>
             </w:r>
@@ -7460,6 +7477,7 @@
           </w:tcPr>
           <w:p>
             <w:pPr>
+              <w:bidi w:val="1"/>
               <w:rPr>
                 <w:b w:val="1"/>
                 <w:bCs w:val="1"/>
@@ -7543,6 +7561,7 @@
           </w:tcPr>
           <w:p>
             <w:pPr>
+              <w:bidi w:val="1"/>
               <w:rPr>
                 <w:color w:val="1b1b1c"/>
                 <w:sz w:val="24"/>
@@ -7635,7 +7654,7 @@
                 <w:color w:val="1b1b1c"/>
                 <w:sz w:val="24"/>
                 <w:szCs w:val="24"/>
-                <w:rtl w:val="0"/>
+                <w:rtl w:val="1"/>
               </w:rPr>
               <w:t xml:space="preserve"> </w:t>
             </w:r>
@@ -7659,7 +7678,7 @@
                 <w:color w:val="1b1b1c"/>
                 <w:sz w:val="24"/>
                 <w:szCs w:val="24"/>
-                <w:rtl w:val="0"/>
+                <w:rtl w:val="1"/>
               </w:rPr>
               <w:t xml:space="preserve"> </w:t>
             </w:r>
@@ -7695,7 +7714,7 @@
                 <w:color w:val="1b1b1c"/>
                 <w:sz w:val="24"/>
                 <w:szCs w:val="24"/>
-                <w:rtl w:val="0"/>
+                <w:rtl w:val="1"/>
               </w:rPr>
               <w:t xml:space="preserve"> </w:t>
             </w:r>
@@ -7719,7 +7738,7 @@
                 <w:color w:val="1b1b1c"/>
                 <w:sz w:val="24"/>
                 <w:szCs w:val="24"/>
-                <w:rtl w:val="0"/>
+                <w:rtl w:val="1"/>
               </w:rPr>
               <w:t xml:space="preserve"> </w:t>
             </w:r>
@@ -7791,7 +7810,7 @@
                 <w:color w:val="1b1b1c"/>
                 <w:sz w:val="24"/>
                 <w:szCs w:val="24"/>
-                <w:rtl w:val="0"/>
+                <w:rtl w:val="1"/>
               </w:rPr>
               <w:t xml:space="preserve">.[1, 2]</w:t>
             </w:r>
@@ -7822,6 +7841,7 @@
           </w:tcPr>
           <w:p>
             <w:pPr>
+              <w:bidi w:val="1"/>
               <w:rPr>
                 <w:b w:val="1"/>
                 <w:bCs w:val="1"/>
@@ -7883,6 +7903,7 @@
           </w:tcPr>
           <w:p>
             <w:pPr>
+              <w:bidi w:val="1"/>
               <w:rPr>
                 <w:color w:val="1b1b1c"/>
                 <w:sz w:val="24"/>
@@ -8155,7 +8176,7 @@
                 <w:color w:val="1b1b1c"/>
                 <w:sz w:val="24"/>
                 <w:szCs w:val="24"/>
-                <w:rtl w:val="0"/>
+                <w:rtl w:val="1"/>
               </w:rPr>
               <w:t xml:space="preserve">").[2]</w:t>
             </w:r>
@@ -8186,6 +8207,7 @@
           </w:tcPr>
           <w:p>
             <w:pPr>
+              <w:bidi w:val="1"/>
               <w:rPr>
                 <w:b w:val="1"/>
                 <w:bCs w:val="1"/>
@@ -8313,6 +8335,7 @@
           </w:tcPr>
           <w:p>
             <w:pPr>
+              <w:bidi w:val="1"/>
               <w:rPr>
                 <w:color w:val="1b1b1c"/>
                 <w:sz w:val="24"/>
@@ -8603,7 +8626,7 @@
                 <w:color w:val="1b1b1c"/>
                 <w:sz w:val="24"/>
                 <w:szCs w:val="24"/>
-                <w:rtl w:val="0"/>
+                <w:rtl w:val="1"/>
               </w:rPr>
               <w:t xml:space="preserve">.[1, 2]</w:t>
             </w:r>
@@ -8614,6 +8637,7 @@
     <w:p>
       <w:pPr>
         <w:shd w:fill="ffffff" w:val="clear"/>
+        <w:bidi w:val="1"/>
         <w:rPr>
           <w:color w:val="1b1b1c"/>
           <w:sz w:val="24"/>
@@ -9516,7 +9540,7 @@
           <w:color w:val="1b1b1c"/>
           <w:sz w:val="24"/>
           <w:szCs w:val="24"/>
-          <w:rtl w:val="0"/>
+          <w:rtl w:val="1"/>
         </w:rPr>
         <w:t xml:space="preserve">.[1]</w:t>
       </w:r>
@@ -9524,6 +9548,7 @@
     <w:p>
       <w:pPr>
         <w:shd w:fill="ffffff" w:val="clear"/>
+        <w:bidi w:val="1"/>
         <w:rPr>
           <w:color w:val="1b1b1c"/>
           <w:sz w:val="24"/>
@@ -9543,6 +9568,7 @@
     <w:p>
       <w:pPr>
         <w:shd w:fill="ffffff" w:val="clear"/>
+        <w:bidi w:val="1"/>
         <w:rPr>
           <w:b w:val="1"/>
           <w:bCs w:val="1"/>
@@ -9632,6 +9658,7 @@
     <w:p>
       <w:pPr>
         <w:shd w:fill="ffffff" w:val="clear"/>
+        <w:bidi w:val="1"/>
         <w:rPr>
           <w:color w:val="1b1b1c"/>
           <w:sz w:val="24"/>
@@ -10768,7 +10795,7 @@
           <w:color w:val="1b1b1c"/>
           <w:sz w:val="24"/>
           <w:szCs w:val="24"/>
-          <w:rtl w:val="0"/>
+          <w:rtl w:val="1"/>
         </w:rPr>
         <w:t xml:space="preserve">.[2]</w:t>
       </w:r>
@@ -10776,6 +10803,7 @@
     <w:p>
       <w:pPr>
         <w:shd w:fill="ffffff" w:val="clear"/>
+        <w:bidi w:val="1"/>
         <w:rPr>
           <w:color w:val="1b1b1c"/>
           <w:sz w:val="24"/>
@@ -11840,7 +11868,7 @@
           <w:color w:val="1b1b1c"/>
           <w:sz w:val="24"/>
           <w:szCs w:val="24"/>
-          <w:rtl w:val="0"/>
+          <w:rtl w:val="1"/>
         </w:rPr>
         <w:t xml:space="preserve">.[1]</w:t>
       </w:r>
@@ -11848,6 +11876,7 @@
     <w:p>
       <w:pPr>
         <w:shd w:fill="ffffff" w:val="clear"/>
+        <w:bidi w:val="1"/>
         <w:rPr>
           <w:color w:val="1b1b1c"/>
           <w:sz w:val="24"/>
@@ -13236,7 +13265,7 @@
           <w:color w:val="1b1b1c"/>
           <w:sz w:val="24"/>
           <w:szCs w:val="24"/>
-          <w:rtl w:val="0"/>
+          <w:rtl w:val="1"/>
         </w:rPr>
         <w:t xml:space="preserve">.</w:t>
       </w:r>
@@ -13244,6 +13273,7 @@
     <w:p>
       <w:pPr>
         <w:shd w:fill="ffffff" w:val="clear"/>
+        <w:bidi w:val="1"/>
         <w:rPr>
           <w:color w:val="1b1b1c"/>
           <w:sz w:val="24"/>
@@ -13263,6 +13293,7 @@
     <w:p>
       <w:pPr>
         <w:shd w:fill="ffffff" w:val="clear"/>
+        <w:bidi w:val="1"/>
         <w:rPr>
           <w:b w:val="1"/>
           <w:bCs w:val="1"/>
@@ -13462,6 +13493,7 @@
     <w:p>
       <w:pPr>
         <w:shd w:fill="ffffff" w:val="clear"/>
+        <w:bidi w:val="1"/>
         <w:rPr>
           <w:color w:val="1b1b1c"/>
           <w:sz w:val="24"/>
@@ -14490,7 +14522,7 @@
           <w:color w:val="1b1b1c"/>
           <w:sz w:val="24"/>
           <w:szCs w:val="24"/>
-          <w:rtl w:val="0"/>
+          <w:rtl w:val="1"/>
         </w:rPr>
         <w:t xml:space="preserve">.[1, 2]</w:t>
       </w:r>
@@ -14498,6 +14530,7 @@
     <w:p>
       <w:pPr>
         <w:shd w:fill="ffffff" w:val="clear"/>
+        <w:bidi w:val="1"/>
         <w:rPr>
           <w:color w:val="1b1b1c"/>
           <w:sz w:val="24"/>
@@ -16174,7 +16207,7 @@
           <w:color w:val="1b1b1c"/>
           <w:sz w:val="24"/>
           <w:szCs w:val="24"/>
-          <w:rtl w:val="0"/>
+          <w:rtl w:val="1"/>
         </w:rPr>
         <w:t xml:space="preserve">".[1]</w:t>
       </w:r>
@@ -16182,6 +16215,7 @@
     <w:p>
       <w:pPr>
         <w:shd w:fill="ffffff" w:val="clear"/>
+        <w:bidi w:val="1"/>
         <w:rPr>
           <w:color w:val="1b1b1c"/>
           <w:sz w:val="24"/>
@@ -16201,6 +16235,7 @@
     <w:p>
       <w:pPr>
         <w:shd w:fill="ffffff" w:val="clear"/>
+        <w:bidi w:val="1"/>
         <w:rPr>
           <w:b w:val="1"/>
           <w:bCs w:val="1"/>
@@ -16356,6 +16391,7 @@
     <w:p>
       <w:pPr>
         <w:shd w:fill="ffffff" w:val="clear"/>
+        <w:bidi w:val="1"/>
         <w:rPr>
           <w:color w:val="1b1b1c"/>
           <w:sz w:val="24"/>
@@ -17096,7 +17132,7 @@
           <w:color w:val="1b1b1c"/>
           <w:sz w:val="24"/>
           <w:szCs w:val="24"/>
-          <w:rtl w:val="0"/>
+          <w:rtl w:val="1"/>
         </w:rPr>
         <w:t xml:space="preserve">.[2, 4]</w:t>
       </w:r>
@@ -17104,6 +17140,7 @@
     <w:tbl>
       <w:tblPr>
         <w:tblStyle w:val="Table2"/>
+        <w:bidiVisual w:val="1"/>
         <w:tblW w:w="10960.0" w:type="dxa"/>
         <w:jc w:val="left"/>
         <w:tblBorders>
@@ -17151,6 +17188,7 @@
           </w:tcPr>
           <w:p>
             <w:pPr>
+              <w:bidi w:val="1"/>
               <w:jc w:val="center"/>
               <w:rPr>
                 <w:b w:val="1"/>
@@ -17389,6 +17427,7 @@
           </w:tcPr>
           <w:p>
             <w:pPr>
+              <w:bidi w:val="1"/>
               <w:jc w:val="center"/>
               <w:rPr>
                 <w:color w:val="1b1b1c"/>
@@ -17428,6 +17467,7 @@
           </w:tcPr>
           <w:p>
             <w:pPr>
+              <w:bidi w:val="1"/>
               <w:rPr>
                 <w:b w:val="1"/>
                 <w:bCs w:val="1"/>
@@ -17555,6 +17595,7 @@
           </w:tcPr>
           <w:p>
             <w:pPr>
+              <w:bidi w:val="1"/>
               <w:rPr>
                 <w:color w:val="1b1b1c"/>
                 <w:sz w:val="24"/>
@@ -17827,7 +17868,7 @@
                 <w:color w:val="1b1b1c"/>
                 <w:sz w:val="24"/>
                 <w:szCs w:val="24"/>
-                <w:rtl w:val="0"/>
+                <w:rtl w:val="1"/>
               </w:rPr>
               <w:t xml:space="preserve">.[2]</w:t>
             </w:r>
@@ -17858,6 +17899,7 @@
           </w:tcPr>
           <w:p>
             <w:pPr>
+              <w:bidi w:val="1"/>
               <w:rPr>
                 <w:b w:val="1"/>
                 <w:bCs w:val="1"/>
@@ -17941,6 +17983,7 @@
           </w:tcPr>
           <w:p>
             <w:pPr>
+              <w:bidi w:val="1"/>
               <w:rPr>
                 <w:color w:val="1b1b1c"/>
                 <w:sz w:val="24"/>
@@ -18195,7 +18238,7 @@
                 <w:color w:val="1b1b1c"/>
                 <w:sz w:val="24"/>
                 <w:szCs w:val="24"/>
-                <w:rtl w:val="0"/>
+                <w:rtl w:val="1"/>
               </w:rPr>
               <w:t xml:space="preserve">.[2, 4]</w:t>
             </w:r>
@@ -18226,6 +18269,7 @@
           </w:tcPr>
           <w:p>
             <w:pPr>
+              <w:bidi w:val="1"/>
               <w:rPr>
                 <w:b w:val="1"/>
                 <w:bCs w:val="1"/>
@@ -18296,7 +18340,7 @@
                 <w:color w:val="1b1b1c"/>
                 <w:sz w:val="24"/>
                 <w:szCs w:val="24"/>
-                <w:rtl w:val="0"/>
+                <w:rtl w:val="1"/>
               </w:rPr>
               <w:t xml:space="preserve">)</w:t>
             </w:r>
@@ -18320,6 +18364,7 @@
           </w:tcPr>
           <w:p>
             <w:pPr>
+              <w:bidi w:val="1"/>
               <w:rPr>
                 <w:color w:val="1b1b1c"/>
                 <w:sz w:val="24"/>
@@ -18718,7 +18763,7 @@
                 <w:color w:val="1b1b1c"/>
                 <w:sz w:val="24"/>
                 <w:szCs w:val="24"/>
-                <w:rtl w:val="0"/>
+                <w:rtl w:val="1"/>
               </w:rPr>
               <w:t xml:space="preserve">.[2, 4]</w:t>
             </w:r>
@@ -18749,6 +18794,7 @@
           </w:tcPr>
           <w:p>
             <w:pPr>
+              <w:bidi w:val="1"/>
               <w:rPr>
                 <w:b w:val="1"/>
                 <w:bCs w:val="1"/>
@@ -18832,6 +18878,7 @@
           </w:tcPr>
           <w:p>
             <w:pPr>
+              <w:bidi w:val="1"/>
               <w:rPr>
                 <w:color w:val="1b1b1c"/>
                 <w:sz w:val="24"/>
@@ -19284,7 +19331,7 @@
                 <w:color w:val="1b1b1c"/>
                 <w:sz w:val="24"/>
                 <w:szCs w:val="24"/>
-                <w:rtl w:val="0"/>
+                <w:rtl w:val="1"/>
               </w:rPr>
               <w:t xml:space="preserve"> (1989).[2]</w:t>
             </w:r>
@@ -19315,6 +19362,7 @@
           </w:tcPr>
           <w:p>
             <w:pPr>
+              <w:bidi w:val="1"/>
               <w:rPr>
                 <w:b w:val="1"/>
                 <w:bCs w:val="1"/>
@@ -19398,6 +19446,7 @@
           </w:tcPr>
           <w:p>
             <w:pPr>
+              <w:bidi w:val="1"/>
               <w:rPr>
                 <w:color w:val="1b1b1c"/>
                 <w:sz w:val="24"/>
@@ -19699,7 +19748,7 @@
                 <w:color w:val="1b1b1c"/>
                 <w:sz w:val="24"/>
                 <w:szCs w:val="24"/>
-                <w:rtl w:val="0"/>
+                <w:rtl w:val="1"/>
               </w:rPr>
               <w:t xml:space="preserve"> </w:t>
             </w:r>
@@ -19825,7 +19874,7 @@
                 <w:color w:val="1b1b1c"/>
                 <w:sz w:val="24"/>
                 <w:szCs w:val="24"/>
-                <w:rtl w:val="0"/>
+                <w:rtl w:val="1"/>
               </w:rPr>
               <w:t xml:space="preserve">).[2]</w:t>
             </w:r>
@@ -19836,6 +19885,7 @@
     <w:p>
       <w:pPr>
         <w:shd w:fill="ffffff" w:val="clear"/>
+        <w:bidi w:val="1"/>
         <w:rPr>
           <w:color w:val="1b1b1c"/>
           <w:sz w:val="24"/>
@@ -20684,7 +20734,7 @@
           <w:color w:val="1b1b1c"/>
           <w:sz w:val="24"/>
           <w:szCs w:val="24"/>
-          <w:rtl w:val="0"/>
+          <w:rtl w:val="1"/>
         </w:rPr>
         <w:t xml:space="preserve">.[2]</w:t>
       </w:r>
@@ -20692,6 +20742,7 @@
     <w:p>
       <w:pPr>
         <w:shd w:fill="ffffff" w:val="clear"/>
+        <w:bidi w:val="1"/>
         <w:rPr>
           <w:color w:val="1b1b1c"/>
           <w:sz w:val="24"/>
@@ -20711,6 +20762,7 @@
     <w:p>
       <w:pPr>
         <w:shd w:fill="ffffff" w:val="clear"/>
+        <w:bidi w:val="1"/>
         <w:rPr>
           <w:b w:val="1"/>
           <w:bCs w:val="1"/>
@@ -20866,6 +20918,7 @@
     <w:p>
       <w:pPr>
         <w:shd w:fill="ffffff" w:val="clear"/>
+        <w:bidi w:val="1"/>
         <w:rPr>
           <w:color w:val="1b1b1c"/>
           <w:sz w:val="24"/>
@@ -21714,7 +21767,7 @@
           <w:color w:val="1b1b1c"/>
           <w:sz w:val="24"/>
           <w:szCs w:val="24"/>
-          <w:rtl w:val="0"/>
+          <w:rtl w:val="1"/>
         </w:rPr>
         <w:t xml:space="preserve"> [2]:</w:t>
       </w:r>
@@ -21722,6 +21775,7 @@
     <w:p>
       <w:pPr>
         <w:shd w:fill="ffffff" w:val="clear"/>
+        <w:bidi w:val="1"/>
         <w:rPr>
           <w:b w:val="1"/>
           <w:bCs w:val="1"/>
@@ -21880,7 +21934,7 @@
           <w:color w:val="1b1b1c"/>
           <w:sz w:val="21"/>
           <w:szCs w:val="21"/>
-          <w:rtl w:val="0"/>
+          <w:rtl w:val="1"/>
         </w:rPr>
         <w:t xml:space="preserve">"</w:t>
       </w:r>
@@ -21888,6 +21942,7 @@
     <w:p>
       <w:pPr>
         <w:shd w:fill="ffffff" w:val="clear"/>
+        <w:bidi w:val="1"/>
         <w:rPr>
           <w:color w:val="1b1b1c"/>
           <w:sz w:val="24"/>
@@ -22754,7 +22809,7 @@
           <w:color w:val="1b1b1c"/>
           <w:sz w:val="24"/>
           <w:szCs w:val="24"/>
-          <w:rtl w:val="0"/>
+          <w:rtl w:val="1"/>
         </w:rPr>
         <w:t xml:space="preserve">.[1]</w:t>
       </w:r>
@@ -22762,6 +22817,7 @@
     <w:p>
       <w:pPr>
         <w:shd w:fill="ffffff" w:val="clear"/>
+        <w:bidi w:val="1"/>
         <w:rPr>
           <w:color w:val="1b1b1c"/>
           <w:sz w:val="24"/>
@@ -23520,7 +23576,7 @@
           <w:color w:val="1b1b1c"/>
           <w:sz w:val="24"/>
           <w:szCs w:val="24"/>
-          <w:rtl w:val="0"/>
+          <w:rtl w:val="1"/>
         </w:rPr>
         <w:t xml:space="preserve">.</w:t>
       </w:r>
@@ -23528,6 +23584,7 @@
     <w:p>
       <w:pPr>
         <w:shd w:fill="ffffff" w:val="clear"/>
+        <w:bidi w:val="1"/>
         <w:rPr>
           <w:b w:val="1"/>
           <w:bCs w:val="1"/>
@@ -23708,7 +23765,7 @@
           <w:color w:val="1b1b1c"/>
           <w:sz w:val="21"/>
           <w:szCs w:val="21"/>
-          <w:rtl w:val="0"/>
+          <w:rtl w:val="1"/>
         </w:rPr>
         <w:t xml:space="preserve">)</w:t>
       </w:r>
@@ -23716,6 +23773,7 @@
     <w:p>
       <w:pPr>
         <w:shd w:fill="ffffff" w:val="clear"/>
+        <w:bidi w:val="1"/>
         <w:rPr>
           <w:color w:val="1b1b1c"/>
           <w:sz w:val="24"/>
@@ -24636,7 +24694,7 @@
           <w:color w:val="1b1b1c"/>
           <w:sz w:val="24"/>
           <w:szCs w:val="24"/>
-          <w:rtl w:val="0"/>
+          <w:rtl w:val="1"/>
         </w:rPr>
         <w:t xml:space="preserve">.</w:t>
       </w:r>
@@ -24644,6 +24702,7 @@
     <w:p>
       <w:pPr>
         <w:shd w:fill="ffffff" w:val="clear"/>
+        <w:bidi w:val="1"/>
         <w:rPr>
           <w:color w:val="1b1b1c"/>
           <w:sz w:val="24"/>
@@ -25366,7 +25425,7 @@
           <w:color w:val="1b1b1c"/>
           <w:sz w:val="24"/>
           <w:szCs w:val="24"/>
-          <w:rtl w:val="0"/>
+          <w:rtl w:val="1"/>
         </w:rPr>
         <w:t xml:space="preserve">.[1, 2]</w:t>
       </w:r>
@@ -25374,6 +25433,7 @@
     <w:p>
       <w:pPr>
         <w:shd w:fill="ffffff" w:val="clear"/>
+        <w:bidi w:val="1"/>
         <w:rPr>
           <w:color w:val="1b1b1c"/>
           <w:sz w:val="24"/>
@@ -25393,6 +25453,7 @@
     <w:p>
       <w:pPr>
         <w:shd w:fill="ffffff" w:val="clear"/>
+        <w:bidi w:val="1"/>
         <w:rPr>
           <w:b w:val="1"/>
           <w:bCs w:val="1"/>
@@ -25438,6 +25499,7 @@
     <w:p>
       <w:pPr>
         <w:shd w:fill="ffffff" w:val="clear"/>
+        <w:bidi w:val="1"/>
         <w:rPr>
           <w:color w:val="1b1b1c"/>
           <w:sz w:val="24"/>
@@ -26106,7 +26168,7 @@
           <w:color w:val="1b1b1c"/>
           <w:sz w:val="24"/>
           <w:szCs w:val="24"/>
-          <w:rtl w:val="0"/>
+          <w:rtl w:val="1"/>
         </w:rPr>
         <w:t xml:space="preserve">.[1, 2]</w:t>
       </w:r>
@@ -26114,6 +26176,7 @@
     <w:p>
       <w:pPr>
         <w:shd w:fill="ffffff" w:val="clear"/>
+        <w:bidi w:val="1"/>
         <w:rPr>
           <w:color w:val="1b1b1c"/>
           <w:sz w:val="24"/>
@@ -26944,7 +27007,7 @@
           <w:color w:val="1b1b1c"/>
           <w:sz w:val="24"/>
           <w:szCs w:val="24"/>
-          <w:rtl w:val="0"/>
+          <w:rtl w:val="1"/>
         </w:rPr>
         <w:t xml:space="preserve">.[1, 2]</w:t>
       </w:r>
@@ -26952,6 +27015,7 @@
     <w:p>
       <w:pPr>
         <w:shd w:fill="ffffff" w:val="clear"/>
+        <w:bidi w:val="1"/>
         <w:rPr>
           <w:color w:val="1b1b1c"/>
           <w:sz w:val="24"/>
@@ -27476,7 +27540,7 @@
           <w:color w:val="1b1b1c"/>
           <w:sz w:val="24"/>
           <w:szCs w:val="24"/>
-          <w:rtl w:val="0"/>
+          <w:rtl w:val="1"/>
         </w:rPr>
         <w:t xml:space="preserve">.[2, 4]</w:t>
       </w:r>
@@ -27484,6 +27548,7 @@
     <w:p>
       <w:pPr>
         <w:shd w:fill="ffffff" w:val="clear"/>
+        <w:bidi w:val="1"/>
         <w:rPr>
           <w:color w:val="1b1b1c"/>
           <w:sz w:val="24"/>
@@ -27506,6 +27571,7 @@
           <w:ilvl w:val="0"/>
           <w:numId w:val="1"/>
         </w:numPr>
+        <w:bidi w:val="1"/>
         <w:spacing w:after="0" w:afterAutospacing="0" w:lineRule="auto"/>
         <w:ind w:left="720" w:hanging="360"/>
         <w:rPr>
@@ -27563,7 +27629,7 @@
           <w:color w:val="1b1b1c"/>
           <w:sz w:val="24"/>
           <w:szCs w:val="24"/>
-          <w:rtl w:val="0"/>
+          <w:rtl w:val="1"/>
         </w:rPr>
         <w:t xml:space="preserve">, </w:t>
       </w:r>
@@ -27591,6 +27657,7 @@
           <w:ilvl w:val="0"/>
           <w:numId w:val="1"/>
         </w:numPr>
+        <w:bidi w:val="1"/>
         <w:spacing w:after="0" w:afterAutospacing="0" w:lineRule="auto"/>
         <w:ind w:left="720" w:hanging="360"/>
         <w:rPr>
@@ -27666,7 +27733,7 @@
           <w:color w:val="1b1b1c"/>
           <w:sz w:val="24"/>
           <w:szCs w:val="24"/>
-          <w:rtl w:val="0"/>
+          <w:rtl w:val="1"/>
         </w:rPr>
         <w:t xml:space="preserve">, </w:t>
       </w:r>
@@ -27694,6 +27761,7 @@
           <w:ilvl w:val="0"/>
           <w:numId w:val="1"/>
         </w:numPr>
+        <w:bidi w:val="1"/>
         <w:spacing w:after="0" w:afterAutospacing="0" w:lineRule="auto"/>
         <w:ind w:left="720" w:hanging="360"/>
         <w:rPr>
@@ -27895,9 +27963,18 @@
           <w:color w:val="1b1b1c"/>
           <w:sz w:val="24"/>
           <w:szCs w:val="24"/>
+          <w:rtl w:val="1"/>
+        </w:rPr>
+        <w:t xml:space="preserve"> </w:t>
+      </w:r>
+      <w:r>
+        <w:rPr>
+          <w:color w:val="1b1b1c"/>
+          <w:sz w:val="24"/>
+          <w:szCs w:val="24"/>
           <w:rtl w:val="0"/>
         </w:rPr>
-        <w:t xml:space="preserve"> </w:t>
+        <w:t xml:space="preserve">Man</w:t>
       </w:r>
       <w:r>
         <w:rPr>
@@ -27906,7 +27983,7 @@
           <w:szCs w:val="24"/>
           <w:rtl w:val="0"/>
         </w:rPr>
-        <w:t xml:space="preserve">Man</w:t>
+        <w:t xml:space="preserve"> </w:t>
       </w:r>
       <w:r>
         <w:rPr>
@@ -27915,7 +27992,7 @@
           <w:szCs w:val="24"/>
           <w:rtl w:val="0"/>
         </w:rPr>
-        <w:t xml:space="preserve"> </w:t>
+        <w:t xml:space="preserve">will</w:t>
       </w:r>
       <w:r>
         <w:rPr>
@@ -27924,7 +28001,7 @@
           <w:szCs w:val="24"/>
           <w:rtl w:val="0"/>
         </w:rPr>
-        <w:t xml:space="preserve">will</w:t>
+        <w:t xml:space="preserve"> </w:t>
       </w:r>
       <w:r>
         <w:rPr>
@@ -27933,7 +28010,7 @@
           <w:szCs w:val="24"/>
           <w:rtl w:val="0"/>
         </w:rPr>
-        <w:t xml:space="preserve"> </w:t>
+        <w:t xml:space="preserve">have</w:t>
       </w:r>
       <w:r>
         <w:rPr>
@@ -27942,7 +28019,7 @@
           <w:szCs w:val="24"/>
           <w:rtl w:val="0"/>
         </w:rPr>
-        <w:t xml:space="preserve">have</w:t>
+        <w:t xml:space="preserve"> </w:t>
       </w:r>
       <w:r>
         <w:rPr>
@@ -27951,7 +28028,7 @@
           <w:szCs w:val="24"/>
           <w:rtl w:val="0"/>
         </w:rPr>
-        <w:t xml:space="preserve"> </w:t>
+        <w:t xml:space="preserve">to</w:t>
       </w:r>
       <w:r>
         <w:rPr>
@@ -27960,6 +28037,195 @@
           <w:szCs w:val="24"/>
           <w:rtl w:val="0"/>
         </w:rPr>
+        <w:t xml:space="preserve"> </w:t>
+      </w:r>
+      <w:r>
+        <w:rPr>
+          <w:color w:val="1b1b1c"/>
+          <w:sz w:val="24"/>
+          <w:szCs w:val="24"/>
+          <w:rtl w:val="0"/>
+        </w:rPr>
+        <w:t xml:space="preserve">give</w:t>
+      </w:r>
+      <w:r>
+        <w:rPr>
+          <w:color w:val="1b1b1c"/>
+          <w:sz w:val="24"/>
+          <w:szCs w:val="24"/>
+          <w:rtl w:val="0"/>
+        </w:rPr>
+        <w:t xml:space="preserve"> </w:t>
+      </w:r>
+      <w:r>
+        <w:rPr>
+          <w:color w:val="1b1b1c"/>
+          <w:sz w:val="24"/>
+          <w:szCs w:val="24"/>
+          <w:rtl w:val="0"/>
+        </w:rPr>
+        <w:t xml:space="preserve">account</w:t>
+      </w:r>
+      <w:r>
+        <w:rPr>
+          <w:color w:val="1b1b1c"/>
+          <w:sz w:val="24"/>
+          <w:szCs w:val="24"/>
+          <w:rtl w:val="0"/>
+        </w:rPr>
+        <w:t xml:space="preserve"> </w:t>
+      </w:r>
+      <w:r>
+        <w:rPr>
+          <w:color w:val="1b1b1c"/>
+          <w:sz w:val="24"/>
+          <w:szCs w:val="24"/>
+          <w:rtl w:val="0"/>
+        </w:rPr>
+        <w:t xml:space="preserve">in</w:t>
+      </w:r>
+      <w:r>
+        <w:rPr>
+          <w:color w:val="1b1b1c"/>
+          <w:sz w:val="24"/>
+          <w:szCs w:val="24"/>
+          <w:rtl w:val="0"/>
+        </w:rPr>
+        <w:t xml:space="preserve"> </w:t>
+      </w:r>
+      <w:r>
+        <w:rPr>
+          <w:color w:val="1b1b1c"/>
+          <w:sz w:val="24"/>
+          <w:szCs w:val="24"/>
+          <w:rtl w:val="0"/>
+        </w:rPr>
+        <w:t xml:space="preserve">the</w:t>
+      </w:r>
+      <w:r>
+        <w:rPr>
+          <w:color w:val="1b1b1c"/>
+          <w:sz w:val="24"/>
+          <w:szCs w:val="24"/>
+          <w:rtl w:val="0"/>
+        </w:rPr>
+        <w:t xml:space="preserve"> </w:t>
+      </w:r>
+      <w:r>
+        <w:rPr>
+          <w:color w:val="1b1b1c"/>
+          <w:sz w:val="24"/>
+          <w:szCs w:val="24"/>
+          <w:rtl w:val="0"/>
+        </w:rPr>
+        <w:t xml:space="preserve">future</w:t>
+      </w:r>
+      <w:r>
+        <w:rPr>
+          <w:color w:val="1b1b1c"/>
+          <w:sz w:val="24"/>
+          <w:szCs w:val="24"/>
+          <w:rtl w:val="0"/>
+        </w:rPr>
+        <w:t xml:space="preserve"> </w:t>
+      </w:r>
+      <w:r>
+        <w:rPr>
+          <w:color w:val="1b1b1c"/>
+          <w:sz w:val="24"/>
+          <w:szCs w:val="24"/>
+          <w:rtl w:val="0"/>
+        </w:rPr>
+        <w:t xml:space="preserve">for</w:t>
+      </w:r>
+      <w:r>
+        <w:rPr>
+          <w:color w:val="1b1b1c"/>
+          <w:sz w:val="24"/>
+          <w:szCs w:val="24"/>
+          <w:rtl w:val="0"/>
+        </w:rPr>
+        <w:t xml:space="preserve"> </w:t>
+      </w:r>
+      <w:r>
+        <w:rPr>
+          <w:color w:val="1b1b1c"/>
+          <w:sz w:val="24"/>
+          <w:szCs w:val="24"/>
+          <w:rtl w:val="0"/>
+        </w:rPr>
+        <w:t xml:space="preserve">every</w:t>
+      </w:r>
+      <w:r>
+        <w:rPr>
+          <w:color w:val="1b1b1c"/>
+          <w:sz w:val="24"/>
+          <w:szCs w:val="24"/>
+          <w:rtl w:val="0"/>
+        </w:rPr>
+        <w:t xml:space="preserve"> </w:t>
+      </w:r>
+      <w:r>
+        <w:rPr>
+          <w:color w:val="1b1b1c"/>
+          <w:sz w:val="24"/>
+          <w:szCs w:val="24"/>
+          <w:rtl w:val="0"/>
+        </w:rPr>
+        <w:t xml:space="preserve">lawful</w:t>
+      </w:r>
+      <w:r>
+        <w:rPr>
+          <w:color w:val="1b1b1c"/>
+          <w:sz w:val="24"/>
+          <w:szCs w:val="24"/>
+          <w:rtl w:val="0"/>
+        </w:rPr>
+        <w:t xml:space="preserve"> </w:t>
+      </w:r>
+      <w:r>
+        <w:rPr>
+          <w:color w:val="1b1b1c"/>
+          <w:sz w:val="24"/>
+          <w:szCs w:val="24"/>
+          <w:rtl w:val="0"/>
+        </w:rPr>
+        <w:t xml:space="preserve">enjoyment</w:t>
+      </w:r>
+      <w:r>
+        <w:rPr>
+          <w:color w:val="1b1b1c"/>
+          <w:sz w:val="24"/>
+          <w:szCs w:val="24"/>
+          <w:rtl w:val="0"/>
+        </w:rPr>
+        <w:t xml:space="preserve"> </w:t>
+      </w:r>
+      <w:r>
+        <w:rPr>
+          <w:color w:val="1b1b1c"/>
+          <w:sz w:val="24"/>
+          <w:szCs w:val="24"/>
+          <w:rtl w:val="0"/>
+        </w:rPr>
+        <w:t xml:space="preserve">offered</w:t>
+      </w:r>
+      <w:r>
+        <w:rPr>
+          <w:color w:val="1b1b1c"/>
+          <w:sz w:val="24"/>
+          <w:szCs w:val="24"/>
+          <w:rtl w:val="0"/>
+        </w:rPr>
+        <w:t xml:space="preserve"> </w:t>
+      </w:r>
+      <w:r>
+        <w:rPr>
+          <w:color w:val="1b1b1c"/>
+          <w:sz w:val="24"/>
+          <w:szCs w:val="24"/>
+          <w:rtl w:val="0"/>
+        </w:rPr>
         <w:t xml:space="preserve">to</w:t>
       </w:r>
       <w:r>
@@ -27978,7 +28244,7 @@
           <w:szCs w:val="24"/>
           <w:rtl w:val="0"/>
         </w:rPr>
-        <w:t xml:space="preserve">give</w:t>
+        <w:t xml:space="preserve">him</w:t>
       </w:r>
       <w:r>
         <w:rPr>
@@ -27996,7 +28262,7 @@
           <w:szCs w:val="24"/>
           <w:rtl w:val="0"/>
         </w:rPr>
-        <w:t xml:space="preserve">account</w:t>
+        <w:t xml:space="preserve">which</w:t>
       </w:r>
       <w:r>
         <w:rPr>
@@ -28014,7 +28280,7 @@
           <w:szCs w:val="24"/>
           <w:rtl w:val="0"/>
         </w:rPr>
-        <w:t xml:space="preserve">in</w:t>
+        <w:t xml:space="preserve">he</w:t>
       </w:r>
       <w:r>
         <w:rPr>
@@ -28032,7 +28298,7 @@
           <w:szCs w:val="24"/>
           <w:rtl w:val="0"/>
         </w:rPr>
-        <w:t xml:space="preserve">the</w:t>
+        <w:t xml:space="preserve">has</w:t>
       </w:r>
       <w:r>
         <w:rPr>
@@ -28050,7 +28316,7 @@
           <w:szCs w:val="24"/>
           <w:rtl w:val="0"/>
         </w:rPr>
-        <w:t xml:space="preserve">future</w:t>
+        <w:t xml:space="preserve">ungratefully</w:t>
       </w:r>
       <w:r>
         <w:rPr>
@@ -28068,204 +28334,6 @@
           <w:szCs w:val="24"/>
           <w:rtl w:val="0"/>
         </w:rPr>
-        <w:t xml:space="preserve">for</w:t>
-      </w:r>
-      <w:r>
-        <w:rPr>
-          <w:color w:val="1b1b1c"/>
-          <w:sz w:val="24"/>
-          <w:szCs w:val="24"/>
-          <w:rtl w:val="0"/>
-        </w:rPr>
-        <w:t xml:space="preserve"> </w:t>
-      </w:r>
-      <w:r>
-        <w:rPr>
-          <w:color w:val="1b1b1c"/>
-          <w:sz w:val="24"/>
-          <w:szCs w:val="24"/>
-          <w:rtl w:val="0"/>
-        </w:rPr>
-        <w:t xml:space="preserve">every</w:t>
-      </w:r>
-      <w:r>
-        <w:rPr>
-          <w:color w:val="1b1b1c"/>
-          <w:sz w:val="24"/>
-          <w:szCs w:val="24"/>
-          <w:rtl w:val="0"/>
-        </w:rPr>
-        <w:t xml:space="preserve"> </w:t>
-      </w:r>
-      <w:r>
-        <w:rPr>
-          <w:color w:val="1b1b1c"/>
-          <w:sz w:val="24"/>
-          <w:szCs w:val="24"/>
-          <w:rtl w:val="0"/>
-        </w:rPr>
-        <w:t xml:space="preserve">lawful</w:t>
-      </w:r>
-      <w:r>
-        <w:rPr>
-          <w:color w:val="1b1b1c"/>
-          <w:sz w:val="24"/>
-          <w:szCs w:val="24"/>
-          <w:rtl w:val="0"/>
-        </w:rPr>
-        <w:t xml:space="preserve"> </w:t>
-      </w:r>
-      <w:r>
-        <w:rPr>
-          <w:color w:val="1b1b1c"/>
-          <w:sz w:val="24"/>
-          <w:szCs w:val="24"/>
-          <w:rtl w:val="0"/>
-        </w:rPr>
-        <w:t xml:space="preserve">enjoyment</w:t>
-      </w:r>
-      <w:r>
-        <w:rPr>
-          <w:color w:val="1b1b1c"/>
-          <w:sz w:val="24"/>
-          <w:szCs w:val="24"/>
-          <w:rtl w:val="0"/>
-        </w:rPr>
-        <w:t xml:space="preserve"> </w:t>
-      </w:r>
-      <w:r>
-        <w:rPr>
-          <w:color w:val="1b1b1c"/>
-          <w:sz w:val="24"/>
-          <w:szCs w:val="24"/>
-          <w:rtl w:val="0"/>
-        </w:rPr>
-        <w:t xml:space="preserve">offered</w:t>
-      </w:r>
-      <w:r>
-        <w:rPr>
-          <w:color w:val="1b1b1c"/>
-          <w:sz w:val="24"/>
-          <w:szCs w:val="24"/>
-          <w:rtl w:val="0"/>
-        </w:rPr>
-        <w:t xml:space="preserve"> </w:t>
-      </w:r>
-      <w:r>
-        <w:rPr>
-          <w:color w:val="1b1b1c"/>
-          <w:sz w:val="24"/>
-          <w:szCs w:val="24"/>
-          <w:rtl w:val="0"/>
-        </w:rPr>
-        <w:t xml:space="preserve">to</w:t>
-      </w:r>
-      <w:r>
-        <w:rPr>
-          <w:color w:val="1b1b1c"/>
-          <w:sz w:val="24"/>
-          <w:szCs w:val="24"/>
-          <w:rtl w:val="0"/>
-        </w:rPr>
-        <w:t xml:space="preserve"> </w:t>
-      </w:r>
-      <w:r>
-        <w:rPr>
-          <w:color w:val="1b1b1c"/>
-          <w:sz w:val="24"/>
-          <w:szCs w:val="24"/>
-          <w:rtl w:val="0"/>
-        </w:rPr>
-        <w:t xml:space="preserve">him</w:t>
-      </w:r>
-      <w:r>
-        <w:rPr>
-          <w:color w:val="1b1b1c"/>
-          <w:sz w:val="24"/>
-          <w:szCs w:val="24"/>
-          <w:rtl w:val="0"/>
-        </w:rPr>
-        <w:t xml:space="preserve"> </w:t>
-      </w:r>
-      <w:r>
-        <w:rPr>
-          <w:color w:val="1b1b1c"/>
-          <w:sz w:val="24"/>
-          <w:szCs w:val="24"/>
-          <w:rtl w:val="0"/>
-        </w:rPr>
-        <w:t xml:space="preserve">which</w:t>
-      </w:r>
-      <w:r>
-        <w:rPr>
-          <w:color w:val="1b1b1c"/>
-          <w:sz w:val="24"/>
-          <w:szCs w:val="24"/>
-          <w:rtl w:val="0"/>
-        </w:rPr>
-        <w:t xml:space="preserve"> </w:t>
-      </w:r>
-      <w:r>
-        <w:rPr>
-          <w:color w:val="1b1b1c"/>
-          <w:sz w:val="24"/>
-          <w:szCs w:val="24"/>
-          <w:rtl w:val="0"/>
-        </w:rPr>
-        <w:t xml:space="preserve">he</w:t>
-      </w:r>
-      <w:r>
-        <w:rPr>
-          <w:color w:val="1b1b1c"/>
-          <w:sz w:val="24"/>
-          <w:szCs w:val="24"/>
-          <w:rtl w:val="0"/>
-        </w:rPr>
-        <w:t xml:space="preserve"> </w:t>
-      </w:r>
-      <w:r>
-        <w:rPr>
-          <w:color w:val="1b1b1c"/>
-          <w:sz w:val="24"/>
-          <w:szCs w:val="24"/>
-          <w:rtl w:val="0"/>
-        </w:rPr>
-        <w:t xml:space="preserve">has</w:t>
-      </w:r>
-      <w:r>
-        <w:rPr>
-          <w:color w:val="1b1b1c"/>
-          <w:sz w:val="24"/>
-          <w:szCs w:val="24"/>
-          <w:rtl w:val="0"/>
-        </w:rPr>
-        <w:t xml:space="preserve"> </w:t>
-      </w:r>
-      <w:r>
-        <w:rPr>
-          <w:color w:val="1b1b1c"/>
-          <w:sz w:val="24"/>
-          <w:szCs w:val="24"/>
-          <w:rtl w:val="0"/>
-        </w:rPr>
-        <w:t xml:space="preserve">ungratefully</w:t>
-      </w:r>
-      <w:r>
-        <w:rPr>
-          <w:color w:val="1b1b1c"/>
-          <w:sz w:val="24"/>
-          <w:szCs w:val="24"/>
-          <w:rtl w:val="0"/>
-        </w:rPr>
-        <w:t xml:space="preserve"> </w:t>
-      </w:r>
-      <w:r>
-        <w:rPr>
-          <w:color w:val="1b1b1c"/>
-          <w:sz w:val="24"/>
-          <w:szCs w:val="24"/>
-          <w:rtl w:val="0"/>
-        </w:rPr>
         <w:t xml:space="preserve">refused</w:t>
       </w:r>
       <w:r>
@@ -28273,7 +28341,7 @@
           <w:color w:val="1b1b1c"/>
           <w:sz w:val="24"/>
           <w:szCs w:val="24"/>
-          <w:rtl w:val="0"/>
+          <w:rtl w:val="1"/>
         </w:rPr>
         <w:t xml:space="preserve"> </w:t>
       </w:r>
@@ -28381,7 +28449,7 @@
           <w:color w:val="1b1b1c"/>
           <w:sz w:val="24"/>
           <w:szCs w:val="24"/>
-          <w:rtl w:val="0"/>
+          <w:rtl w:val="1"/>
         </w:rPr>
         <w:t xml:space="preserve">, </w:t>
       </w:r>
@@ -28409,6 +28477,7 @@
           <w:ilvl w:val="0"/>
           <w:numId w:val="1"/>
         </w:numPr>
+        <w:bidi w:val="1"/>
         <w:spacing w:after="180" w:lineRule="auto"/>
         <w:ind w:left="720" w:hanging="360"/>
         <w:rPr>
@@ -28430,7 +28499,7 @@
           <w:color w:val="1b1b1c"/>
           <w:sz w:val="24"/>
           <w:szCs w:val="24"/>
-          <w:rtl w:val="0"/>
+          <w:rtl w:val="1"/>
         </w:rPr>
         <w:t xml:space="preserve"> 58 - </w:t>
       </w:r>
@@ -28736,7 +28805,7 @@
           <w:color w:val="1b1b1c"/>
           <w:sz w:val="24"/>
           <w:szCs w:val="24"/>
-          <w:rtl w:val="0"/>
+          <w:rtl w:val="1"/>
         </w:rPr>
         <w:t xml:space="preserve">, </w:t>
       </w:r>
@@ -28760,6 +28829,7 @@
     </w:p>
     <w:p>
       <w:pPr>
+        <w:bidi w:val="1"/>
         <w:rPr/>
       </w:pPr>
       <w:r>

</xml_diff>